<commit_message>
modificación de word 2
</commit_message>
<xml_diff>
--- a/Commit.docx
+++ b/Commit.docx
@@ -1054,17 +1054,26 @@
           <w:sz w:val="32"/>
           <w:szCs w:val="32"/>
         </w:rPr>
-        <w:t xml:space="preserve">Hablamos de hilos de programación que </w:t>
-      </w:r>
-      <w:r>
-        <w:rPr>
-          <w:rFonts w:ascii="Aptos" w:hAnsi="Aptos" w:eastAsia="Aptos" w:cs="Aptos"/>
-          <w:noProof w:val="0"/>
-          <w:sz w:val="32"/>
-          <w:szCs w:val="32"/>
-          <w:lang w:val="es-ES"/>
-        </w:rPr>
-        <w:t xml:space="preserve"> es la unidad más pequeña de ejecución dentro de un proceso. Es el mecanismo real que usa un programa para lograr paralelismo (o concurrencia)</w:t>
+        <w:t xml:space="preserve">Hablamos de hilos de programación </w:t>
+      </w:r>
+      <w:r>
+        <w:rPr>
+          <w:b w:val="0"/>
+          <w:bCs w:val="0"/>
+          <w:sz w:val="32"/>
+          <w:szCs w:val="32"/>
+        </w:rPr>
+        <w:t>que es</w:t>
+      </w:r>
+      <w:r>
+        <w:rPr>
+          <w:rFonts w:ascii="Aptos" w:hAnsi="Aptos" w:eastAsia="Aptos" w:cs="Aptos"/>
+          <w:noProof w:val="0"/>
+          <w:sz w:val="32"/>
+          <w:szCs w:val="32"/>
+          <w:lang w:val="es-ES"/>
+        </w:rPr>
+        <w:t xml:space="preserve"> la unidad más pequeña de ejecución dentro de un proceso. Es el mecanismo real que usa un programa para lograr paralelismo (o concurrencia)</w:t>
       </w:r>
     </w:p>
     <w:p>
@@ -2090,7 +2099,7 @@
     <w:name w:val="List Paragraph"/>
     <w:basedOn w:val="Normal"/>
     <w:qFormat/>
-    <w:rsid w:val="04C5CB75"/>
+    <w:rsid w:val="78D95CE8"/>
     <w:pPr>
       <w:spacing/>
       <w:ind w:left="720"/>

</xml_diff>

<commit_message>
modificación de word 3
</commit_message>
<xml_diff>
--- a/Commit.docx
+++ b/Commit.docx
@@ -1427,6 +1427,113 @@
           <w:szCs w:val="32"/>
         </w:rPr>
       </w:pPr>
+    </w:p>
+    <w:p>
+      <w:pPr>
+        <w:pStyle w:val="Normal"/>
+        <w:ind w:left="0"/>
+        <w:jc w:val="left"/>
+        <w:rPr>
+          <w:b w:val="1"/>
+          <w:bCs w:val="1"/>
+          <w:sz w:val="32"/>
+          <w:szCs w:val="32"/>
+        </w:rPr>
+      </w:pPr>
+    </w:p>
+    <w:p>
+      <w:pPr>
+        <w:pStyle w:val="Normal"/>
+        <w:ind w:left="0"/>
+        <w:jc w:val="left"/>
+        <w:rPr>
+          <w:b w:val="1"/>
+          <w:bCs w:val="1"/>
+          <w:sz w:val="32"/>
+          <w:szCs w:val="32"/>
+        </w:rPr>
+      </w:pPr>
+    </w:p>
+    <w:p>
+      <w:pPr>
+        <w:pStyle w:val="Normal"/>
+        <w:ind w:left="0"/>
+        <w:jc w:val="left"/>
+        <w:rPr>
+          <w:b w:val="1"/>
+          <w:bCs w:val="1"/>
+          <w:sz w:val="32"/>
+          <w:szCs w:val="32"/>
+        </w:rPr>
+      </w:pPr>
+    </w:p>
+    <w:p>
+      <w:pPr>
+        <w:pStyle w:val="Normal"/>
+        <w:ind w:left="0"/>
+        <w:jc w:val="left"/>
+        <w:rPr>
+          <w:b w:val="1"/>
+          <w:bCs w:val="1"/>
+          <w:sz w:val="32"/>
+          <w:szCs w:val="32"/>
+        </w:rPr>
+      </w:pPr>
+    </w:p>
+    <w:p>
+      <w:pPr>
+        <w:pStyle w:val="Normal"/>
+        <w:ind w:left="0"/>
+        <w:jc w:val="left"/>
+        <w:rPr>
+          <w:b w:val="1"/>
+          <w:bCs w:val="1"/>
+          <w:sz w:val="32"/>
+          <w:szCs w:val="32"/>
+        </w:rPr>
+      </w:pPr>
+    </w:p>
+    <w:p>
+      <w:pPr>
+        <w:pStyle w:val="Normal"/>
+        <w:ind w:left="0"/>
+        <w:jc w:val="left"/>
+        <w:rPr>
+          <w:b w:val="1"/>
+          <w:bCs w:val="1"/>
+          <w:sz w:val="32"/>
+          <w:szCs w:val="32"/>
+        </w:rPr>
+      </w:pPr>
+    </w:p>
+    <w:p>
+      <w:pPr>
+        <w:pStyle w:val="Normal"/>
+        <w:ind w:left="0"/>
+        <w:jc w:val="left"/>
+        <w:rPr>
+          <w:b w:val="1"/>
+          <w:bCs w:val="1"/>
+          <w:sz w:val="32"/>
+          <w:szCs w:val="32"/>
+        </w:rPr>
+      </w:pPr>
+    </w:p>
+    <w:p>
+      <w:pPr>
+        <w:pStyle w:val="Normal"/>
+        <w:ind w:left="0"/>
+        <w:jc w:val="left"/>
+      </w:pPr>
+      <w:r>
+        <w:rPr>
+          <w:b w:val="1"/>
+          <w:bCs w:val="1"/>
+          <w:sz w:val="32"/>
+          <w:szCs w:val="32"/>
+        </w:rPr>
+        <w:t>Hecho por Marin Rodriguez Alex Andres.</w:t>
+      </w:r>
     </w:p>
     <w:sectPr>
       <w:pgSz w:w="11906" w:h="16838" w:orient="portrait"/>
@@ -2099,7 +2206,7 @@
     <w:name w:val="List Paragraph"/>
     <w:basedOn w:val="Normal"/>
     <w:qFormat/>
-    <w:rsid w:val="78D95CE8"/>
+    <w:rsid w:val="6E9BCAF2"/>
     <w:pPr>
       <w:spacing/>
       <w:ind w:left="720"/>

</xml_diff>